<commit_message>
Rebuilt after release recipes, flash limiter fix and the Hurt mapping
</commit_message>
<xml_diff>
--- a/Docs/Manual/out/FeelKit_Video_Guide.docx
+++ b/Docs/Manual/out/FeelKit_Video_Guide.docx
@@ -11,7 +11,7 @@
           <w:noProof/>
         </w:rPr>
         <w:drawing>
-          <wp:anchor distT="0" distB="0" distL="0" distR="0" simplePos="0" relativeHeight="251658240" behindDoc="1" locked="1" layoutInCell="1" allowOverlap="1" wp14:anchorId="6849DD7E" wp14:editId="74C30A87">
+          <wp:anchor distT="0" distB="0" distL="0" distR="0" simplePos="0" relativeHeight="251658240" behindDoc="1" locked="1" layoutInCell="1" allowOverlap="1" wp14:anchorId="194BEB78" wp14:editId="10950E26">
             <wp:simplePos x="0" y="0"/>
             <wp:positionH relativeFrom="page">
               <wp:posOffset>0</wp:posOffset>
@@ -88,7 +88,7 @@
       <w:r>
         <w:fldChar w:fldCharType="separate"/>
       </w:r>
-      <w:hyperlink w:anchor="_Toc242212971" w:history="1">
+      <w:hyperlink w:anchor="_Toc242215112" w:history="1">
         <w:r>
           <w:rPr>
             <w:rStyle w:val="Hyperlink"/>
@@ -115,7 +115,7 @@
             <w:noProof/>
             <w:webHidden/>
           </w:rPr>
-          <w:instrText xml:space="preserve"> PAGEREF _Toc242212971 \h </w:instrText>
+          <w:instrText xml:space="preserve"> PAGEREF _Toc242215112 \h </w:instrText>
         </w:r>
         <w:r>
           <w:rPr>
@@ -162,7 +162,7 @@
           <w14:ligatures w14:val="standardContextual"/>
         </w:rPr>
       </w:pPr>
-      <w:hyperlink w:anchor="_Toc242212972" w:history="1">
+      <w:hyperlink w:anchor="_Toc242215113" w:history="1">
         <w:r>
           <w:rPr>
             <w:rStyle w:val="Hyperlink"/>
@@ -189,7 +189,7 @@
             <w:noProof/>
             <w:webHidden/>
           </w:rPr>
-          <w:instrText xml:space="preserve"> PAGEREF _Toc242212972 \h </w:instrText>
+          <w:instrText xml:space="preserve"> PAGEREF _Toc242215113 \h </w:instrText>
         </w:r>
         <w:r>
           <w:rPr>
@@ -236,7 +236,7 @@
           <w14:ligatures w14:val="standardContextual"/>
         </w:rPr>
       </w:pPr>
-      <w:hyperlink w:anchor="_Toc242212973" w:history="1">
+      <w:hyperlink w:anchor="_Toc242215114" w:history="1">
         <w:r>
           <w:rPr>
             <w:rStyle w:val="Hyperlink"/>
@@ -263,7 +263,7 @@
             <w:noProof/>
             <w:webHidden/>
           </w:rPr>
-          <w:instrText xml:space="preserve"> PAGEREF _Toc242212973 \h </w:instrText>
+          <w:instrText xml:space="preserve"> PAGEREF _Toc242215114 \h </w:instrText>
         </w:r>
         <w:r>
           <w:rPr>
@@ -310,7 +310,7 @@
           <w14:ligatures w14:val="standardContextual"/>
         </w:rPr>
       </w:pPr>
-      <w:hyperlink w:anchor="_Toc242212974" w:history="1">
+      <w:hyperlink w:anchor="_Toc242215115" w:history="1">
         <w:r>
           <w:rPr>
             <w:rStyle w:val="Hyperlink"/>
@@ -337,7 +337,7 @@
             <w:noProof/>
             <w:webHidden/>
           </w:rPr>
-          <w:instrText xml:space="preserve"> PAGEREF _Toc242212974 \h </w:instrText>
+          <w:instrText xml:space="preserve"> PAGEREF _Toc242215115 \h </w:instrText>
         </w:r>
         <w:r>
           <w:rPr>
@@ -384,7 +384,7 @@
           <w14:ligatures w14:val="standardContextual"/>
         </w:rPr>
       </w:pPr>
-      <w:hyperlink w:anchor="_Toc242212975" w:history="1">
+      <w:hyperlink w:anchor="_Toc242215116" w:history="1">
         <w:r>
           <w:rPr>
             <w:rStyle w:val="Hyperlink"/>
@@ -411,7 +411,7 @@
             <w:noProof/>
             <w:webHidden/>
           </w:rPr>
-          <w:instrText xml:space="preserve"> PAGEREF _Toc242212975 \h </w:instrText>
+          <w:instrText xml:space="preserve"> PAGEREF _Toc242215116 \h </w:instrText>
         </w:r>
         <w:r>
           <w:rPr>
@@ -458,7 +458,7 @@
           <w14:ligatures w14:val="standardContextual"/>
         </w:rPr>
       </w:pPr>
-      <w:hyperlink w:anchor="_Toc242212976" w:history="1">
+      <w:hyperlink w:anchor="_Toc242215117" w:history="1">
         <w:r>
           <w:rPr>
             <w:rStyle w:val="Hyperlink"/>
@@ -485,7 +485,7 @@
             <w:noProof/>
             <w:webHidden/>
           </w:rPr>
-          <w:instrText xml:space="preserve"> PAGEREF _Toc242212976 \h </w:instrText>
+          <w:instrText xml:space="preserve"> PAGEREF _Toc242215117 \h </w:instrText>
         </w:r>
         <w:r>
           <w:rPr>
@@ -532,7 +532,7 @@
           <w14:ligatures w14:val="standardContextual"/>
         </w:rPr>
       </w:pPr>
-      <w:hyperlink w:anchor="_Toc242212977" w:history="1">
+      <w:hyperlink w:anchor="_Toc242215118" w:history="1">
         <w:r>
           <w:rPr>
             <w:rStyle w:val="Hyperlink"/>
@@ -559,7 +559,7 @@
             <w:noProof/>
             <w:webHidden/>
           </w:rPr>
-          <w:instrText xml:space="preserve"> PAGEREF _Toc242212977 \h </w:instrText>
+          <w:instrText xml:space="preserve"> PAGEREF _Toc242215118 \h </w:instrText>
         </w:r>
         <w:r>
           <w:rPr>
@@ -606,7 +606,7 @@
           <w14:ligatures w14:val="standardContextual"/>
         </w:rPr>
       </w:pPr>
-      <w:hyperlink w:anchor="_Toc242212978" w:history="1">
+      <w:hyperlink w:anchor="_Toc242215119" w:history="1">
         <w:r>
           <w:rPr>
             <w:rStyle w:val="Hyperlink"/>
@@ -633,7 +633,7 @@
             <w:noProof/>
             <w:webHidden/>
           </w:rPr>
-          <w:instrText xml:space="preserve"> PAGEREF _Toc242212978 \h </w:instrText>
+          <w:instrText xml:space="preserve"> PAGEREF _Toc242215119 \h </w:instrText>
         </w:r>
         <w:r>
           <w:rPr>
@@ -680,7 +680,7 @@
           <w14:ligatures w14:val="standardContextual"/>
         </w:rPr>
       </w:pPr>
-      <w:hyperlink w:anchor="_Toc242212979" w:history="1">
+      <w:hyperlink w:anchor="_Toc242215120" w:history="1">
         <w:r>
           <w:rPr>
             <w:rStyle w:val="Hyperlink"/>
@@ -707,7 +707,7 @@
             <w:noProof/>
             <w:webHidden/>
           </w:rPr>
-          <w:instrText xml:space="preserve"> PAGEREF _Toc242212979 \h </w:instrText>
+          <w:instrText xml:space="preserve"> PAGEREF _Toc242215120 \h </w:instrText>
         </w:r>
         <w:r>
           <w:rPr>
@@ -754,7 +754,7 @@
           <w14:ligatures w14:val="standardContextual"/>
         </w:rPr>
       </w:pPr>
-      <w:hyperlink w:anchor="_Toc242212980" w:history="1">
+      <w:hyperlink w:anchor="_Toc242215121" w:history="1">
         <w:r>
           <w:rPr>
             <w:rStyle w:val="Hyperlink"/>
@@ -781,7 +781,7 @@
             <w:noProof/>
             <w:webHidden/>
           </w:rPr>
-          <w:instrText xml:space="preserve"> PAGEREF _Toc242212980 \h </w:instrText>
+          <w:instrText xml:space="preserve"> PAGEREF _Toc242215121 \h </w:instrText>
         </w:r>
         <w:r>
           <w:rPr>
@@ -828,7 +828,7 @@
           <w14:ligatures w14:val="standardContextual"/>
         </w:rPr>
       </w:pPr>
-      <w:hyperlink w:anchor="_Toc242212981" w:history="1">
+      <w:hyperlink w:anchor="_Toc242215122" w:history="1">
         <w:r>
           <w:rPr>
             <w:rStyle w:val="Hyperlink"/>
@@ -855,7 +855,7 @@
             <w:noProof/>
             <w:webHidden/>
           </w:rPr>
-          <w:instrText xml:space="preserve"> PAGEREF _Toc242212981 \h </w:instrText>
+          <w:instrText xml:space="preserve"> PAGEREF _Toc242215122 \h </w:instrText>
         </w:r>
         <w:r>
           <w:rPr>
@@ -902,7 +902,7 @@
           <w14:ligatures w14:val="standardContextual"/>
         </w:rPr>
       </w:pPr>
-      <w:hyperlink w:anchor="_Toc242212982" w:history="1">
+      <w:hyperlink w:anchor="_Toc242215123" w:history="1">
         <w:r>
           <w:rPr>
             <w:rStyle w:val="Hyperlink"/>
@@ -929,7 +929,7 @@
             <w:noProof/>
             <w:webHidden/>
           </w:rPr>
-          <w:instrText xml:space="preserve"> PAGEREF _Toc242212982 \h </w:instrText>
+          <w:instrText xml:space="preserve"> PAGEREF _Toc242215123 \h </w:instrText>
         </w:r>
         <w:r>
           <w:rPr>
@@ -976,7 +976,7 @@
           <w14:ligatures w14:val="standardContextual"/>
         </w:rPr>
       </w:pPr>
-      <w:hyperlink w:anchor="_Toc242212983" w:history="1">
+      <w:hyperlink w:anchor="_Toc242215124" w:history="1">
         <w:r>
           <w:rPr>
             <w:rStyle w:val="Hyperlink"/>
@@ -1003,7 +1003,7 @@
             <w:noProof/>
             <w:webHidden/>
           </w:rPr>
-          <w:instrText xml:space="preserve"> PAGEREF _Toc242212983 \h </w:instrText>
+          <w:instrText xml:space="preserve"> PAGEREF _Toc242215124 \h </w:instrText>
         </w:r>
         <w:r>
           <w:rPr>
@@ -1050,7 +1050,7 @@
           <w14:ligatures w14:val="standardContextual"/>
         </w:rPr>
       </w:pPr>
-      <w:hyperlink w:anchor="_Toc242212984" w:history="1">
+      <w:hyperlink w:anchor="_Toc242215125" w:history="1">
         <w:r>
           <w:rPr>
             <w:rStyle w:val="Hyperlink"/>
@@ -1077,7 +1077,7 @@
             <w:noProof/>
             <w:webHidden/>
           </w:rPr>
-          <w:instrText xml:space="preserve"> PAGEREF _Toc242212984 \h </w:instrText>
+          <w:instrText xml:space="preserve"> PAGEREF _Toc242215125 \h </w:instrText>
         </w:r>
         <w:r>
           <w:rPr>
@@ -1124,7 +1124,7 @@
           <w14:ligatures w14:val="standardContextual"/>
         </w:rPr>
       </w:pPr>
-      <w:hyperlink w:anchor="_Toc242212985" w:history="1">
+      <w:hyperlink w:anchor="_Toc242215126" w:history="1">
         <w:r>
           <w:rPr>
             <w:rStyle w:val="Hyperlink"/>
@@ -1151,7 +1151,7 @@
             <w:noProof/>
             <w:webHidden/>
           </w:rPr>
-          <w:instrText xml:space="preserve"> PAGEREF _Toc242212985 \h </w:instrText>
+          <w:instrText xml:space="preserve"> PAGEREF _Toc242215126 \h </w:instrText>
         </w:r>
         <w:r>
           <w:rPr>
@@ -1198,7 +1198,7 @@
           <w14:ligatures w14:val="standardContextual"/>
         </w:rPr>
       </w:pPr>
-      <w:hyperlink w:anchor="_Toc242212986" w:history="1">
+      <w:hyperlink w:anchor="_Toc242215127" w:history="1">
         <w:r>
           <w:rPr>
             <w:rStyle w:val="Hyperlink"/>
@@ -1225,7 +1225,7 @@
             <w:noProof/>
             <w:webHidden/>
           </w:rPr>
-          <w:instrText xml:space="preserve"> PAGEREF _Toc242212986 \h </w:instrText>
+          <w:instrText xml:space="preserve"> PAGEREF _Toc242215127 \h </w:instrText>
         </w:r>
         <w:r>
           <w:rPr>
@@ -1272,7 +1272,7 @@
           <w14:ligatures w14:val="standardContextual"/>
         </w:rPr>
       </w:pPr>
-      <w:hyperlink w:anchor="_Toc242212987" w:history="1">
+      <w:hyperlink w:anchor="_Toc242215128" w:history="1">
         <w:r>
           <w:rPr>
             <w:rStyle w:val="Hyperlink"/>
@@ -1299,7 +1299,7 @@
             <w:noProof/>
             <w:webHidden/>
           </w:rPr>
-          <w:instrText xml:space="preserve"> PAGEREF _Toc242212987 \h </w:instrText>
+          <w:instrText xml:space="preserve"> PAGEREF _Toc242215128 \h </w:instrText>
         </w:r>
         <w:r>
           <w:rPr>
@@ -1346,7 +1346,7 @@
           <w14:ligatures w14:val="standardContextual"/>
         </w:rPr>
       </w:pPr>
-      <w:hyperlink w:anchor="_Toc242212988" w:history="1">
+      <w:hyperlink w:anchor="_Toc242215129" w:history="1">
         <w:r>
           <w:rPr>
             <w:rStyle w:val="Hyperlink"/>
@@ -1373,7 +1373,7 @@
             <w:noProof/>
             <w:webHidden/>
           </w:rPr>
-          <w:instrText xml:space="preserve"> PAGEREF _Toc242212988 \h </w:instrText>
+          <w:instrText xml:space="preserve"> PAGEREF _Toc242215129 \h </w:instrText>
         </w:r>
         <w:r>
           <w:rPr>
@@ -1420,7 +1420,7 @@
           <w14:ligatures w14:val="standardContextual"/>
         </w:rPr>
       </w:pPr>
-      <w:hyperlink w:anchor="_Toc242212989" w:history="1">
+      <w:hyperlink w:anchor="_Toc242215130" w:history="1">
         <w:r>
           <w:rPr>
             <w:rStyle w:val="Hyperlink"/>
@@ -1447,7 +1447,7 @@
             <w:noProof/>
             <w:webHidden/>
           </w:rPr>
-          <w:instrText xml:space="preserve"> PAGEREF _Toc242212989 \h </w:instrText>
+          <w:instrText xml:space="preserve"> PAGEREF _Toc242215130 \h </w:instrText>
         </w:r>
         <w:r>
           <w:rPr>
@@ -1494,7 +1494,7 @@
           <w14:ligatures w14:val="standardContextual"/>
         </w:rPr>
       </w:pPr>
-      <w:hyperlink w:anchor="_Toc242212990" w:history="1">
+      <w:hyperlink w:anchor="_Toc242215131" w:history="1">
         <w:r>
           <w:rPr>
             <w:rStyle w:val="Hyperlink"/>
@@ -1521,7 +1521,7 @@
             <w:noProof/>
             <w:webHidden/>
           </w:rPr>
-          <w:instrText xml:space="preserve"> PAGEREF _Toc242212990 \h </w:instrText>
+          <w:instrText xml:space="preserve"> PAGEREF _Toc242215131 \h </w:instrText>
         </w:r>
         <w:r>
           <w:rPr>
@@ -1568,7 +1568,7 @@
           <w14:ligatures w14:val="standardContextual"/>
         </w:rPr>
       </w:pPr>
-      <w:hyperlink w:anchor="_Toc242212991" w:history="1">
+      <w:hyperlink w:anchor="_Toc242215132" w:history="1">
         <w:r>
           <w:rPr>
             <w:rStyle w:val="Hyperlink"/>
@@ -1595,7 +1595,7 @@
             <w:noProof/>
             <w:webHidden/>
           </w:rPr>
-          <w:instrText xml:space="preserve"> PAGEREF _Toc242212991 \h </w:instrText>
+          <w:instrText xml:space="preserve"> PAGEREF _Toc242215132 \h </w:instrText>
         </w:r>
         <w:r>
           <w:rPr>
@@ -1642,7 +1642,7 @@
           <w14:ligatures w14:val="standardContextual"/>
         </w:rPr>
       </w:pPr>
-      <w:hyperlink w:anchor="_Toc242212992" w:history="1">
+      <w:hyperlink w:anchor="_Toc242215133" w:history="1">
         <w:r>
           <w:rPr>
             <w:rStyle w:val="Hyperlink"/>
@@ -1669,7 +1669,7 @@
             <w:noProof/>
             <w:webHidden/>
           </w:rPr>
-          <w:instrText xml:space="preserve"> PAGEREF _Toc242212992 \h </w:instrText>
+          <w:instrText xml:space="preserve"> PAGEREF _Toc242215133 \h </w:instrText>
         </w:r>
         <w:r>
           <w:rPr>
@@ -1716,7 +1716,7 @@
           <w14:ligatures w14:val="standardContextual"/>
         </w:rPr>
       </w:pPr>
-      <w:hyperlink w:anchor="_Toc242212993" w:history="1">
+      <w:hyperlink w:anchor="_Toc242215134" w:history="1">
         <w:r>
           <w:rPr>
             <w:rStyle w:val="Hyperlink"/>
@@ -1743,7 +1743,7 @@
             <w:noProof/>
             <w:webHidden/>
           </w:rPr>
-          <w:instrText xml:space="preserve"> PAGEREF _Toc242212993 \h </w:instrText>
+          <w:instrText xml:space="preserve"> PAGEREF _Toc242215134 \h </w:instrText>
         </w:r>
         <w:r>
           <w:rPr>
@@ -1790,7 +1790,7 @@
           <w14:ligatures w14:val="standardContextual"/>
         </w:rPr>
       </w:pPr>
-      <w:hyperlink w:anchor="_Toc242212994" w:history="1">
+      <w:hyperlink w:anchor="_Toc242215135" w:history="1">
         <w:r>
           <w:rPr>
             <w:rStyle w:val="Hyperlink"/>
@@ -1817,7 +1817,7 @@
             <w:noProof/>
             <w:webHidden/>
           </w:rPr>
-          <w:instrText xml:space="preserve"> PAGEREF _Toc242212994 \h </w:instrText>
+          <w:instrText xml:space="preserve"> PAGEREF _Toc242215135 \h </w:instrText>
         </w:r>
         <w:r>
           <w:rPr>
@@ -1864,7 +1864,7 @@
           <w14:ligatures w14:val="standardContextual"/>
         </w:rPr>
       </w:pPr>
-      <w:hyperlink w:anchor="_Toc242212995" w:history="1">
+      <w:hyperlink w:anchor="_Toc242215136" w:history="1">
         <w:r>
           <w:rPr>
             <w:rStyle w:val="Hyperlink"/>
@@ -1891,7 +1891,7 @@
             <w:noProof/>
             <w:webHidden/>
           </w:rPr>
-          <w:instrText xml:space="preserve"> PAGEREF _Toc242212995 \h </w:instrText>
+          <w:instrText xml:space="preserve"> PAGEREF _Toc242215136 \h </w:instrText>
         </w:r>
         <w:r>
           <w:rPr>
@@ -1938,7 +1938,7 @@
           <w14:ligatures w14:val="standardContextual"/>
         </w:rPr>
       </w:pPr>
-      <w:hyperlink w:anchor="_Toc242212996" w:history="1">
+      <w:hyperlink w:anchor="_Toc242215137" w:history="1">
         <w:r>
           <w:rPr>
             <w:rStyle w:val="Hyperlink"/>
@@ -1965,7 +1965,7 @@
             <w:noProof/>
             <w:webHidden/>
           </w:rPr>
-          <w:instrText xml:space="preserve"> PAGEREF _Toc242212996 \h </w:instrText>
+          <w:instrText xml:space="preserve"> PAGEREF _Toc242215137 \h </w:instrText>
         </w:r>
         <w:r>
           <w:rPr>
@@ -2012,7 +2012,7 @@
           <w14:ligatures w14:val="standardContextual"/>
         </w:rPr>
       </w:pPr>
-      <w:hyperlink w:anchor="_Toc242212997" w:history="1">
+      <w:hyperlink w:anchor="_Toc242215138" w:history="1">
         <w:r>
           <w:rPr>
             <w:rStyle w:val="Hyperlink"/>
@@ -2039,7 +2039,7 @@
             <w:noProof/>
             <w:webHidden/>
           </w:rPr>
-          <w:instrText xml:space="preserve"> PAGEREF _Toc242212997 \h </w:instrText>
+          <w:instrText xml:space="preserve"> PAGEREF _Toc242215138 \h </w:instrText>
         </w:r>
         <w:r>
           <w:rPr>
@@ -2086,7 +2086,7 @@
           <w14:ligatures w14:val="standardContextual"/>
         </w:rPr>
       </w:pPr>
-      <w:hyperlink w:anchor="_Toc242212998" w:history="1">
+      <w:hyperlink w:anchor="_Toc242215139" w:history="1">
         <w:r>
           <w:rPr>
             <w:rStyle w:val="Hyperlink"/>
@@ -2113,7 +2113,7 @@
             <w:noProof/>
             <w:webHidden/>
           </w:rPr>
-          <w:instrText xml:space="preserve"> PAGEREF _Toc242212998 \h </w:instrText>
+          <w:instrText xml:space="preserve"> PAGEREF _Toc242215139 \h </w:instrText>
         </w:r>
         <w:r>
           <w:rPr>
@@ -2160,7 +2160,7 @@
           <w14:ligatures w14:val="standardContextual"/>
         </w:rPr>
       </w:pPr>
-      <w:hyperlink w:anchor="_Toc242212999" w:history="1">
+      <w:hyperlink w:anchor="_Toc242215140" w:history="1">
         <w:r>
           <w:rPr>
             <w:rStyle w:val="Hyperlink"/>
@@ -2187,7 +2187,7 @@
             <w:noProof/>
             <w:webHidden/>
           </w:rPr>
-          <w:instrText xml:space="preserve"> PAGEREF _Toc242212999 \h </w:instrText>
+          <w:instrText xml:space="preserve"> PAGEREF _Toc242215140 \h </w:instrText>
         </w:r>
         <w:r>
           <w:rPr>
@@ -2234,7 +2234,7 @@
           <w14:ligatures w14:val="standardContextual"/>
         </w:rPr>
       </w:pPr>
-      <w:hyperlink w:anchor="_Toc242213000" w:history="1">
+      <w:hyperlink w:anchor="_Toc242215141" w:history="1">
         <w:r>
           <w:rPr>
             <w:rStyle w:val="Hyperlink"/>
@@ -2261,7 +2261,7 @@
             <w:noProof/>
             <w:webHidden/>
           </w:rPr>
-          <w:instrText xml:space="preserve"> PAGEREF _Toc242213000 \h </w:instrText>
+          <w:instrText xml:space="preserve"> PAGEREF _Toc242215141 \h </w:instrText>
         </w:r>
         <w:r>
           <w:rPr>
@@ -2308,7 +2308,7 @@
           <w14:ligatures w14:val="standardContextual"/>
         </w:rPr>
       </w:pPr>
-      <w:hyperlink w:anchor="_Toc242213001" w:history="1">
+      <w:hyperlink w:anchor="_Toc242215142" w:history="1">
         <w:r>
           <w:rPr>
             <w:rStyle w:val="Hyperlink"/>
@@ -2335,7 +2335,7 @@
             <w:noProof/>
             <w:webHidden/>
           </w:rPr>
-          <w:instrText xml:space="preserve"> PAGEREF _Toc242213001 \h </w:instrText>
+          <w:instrText xml:space="preserve"> PAGEREF _Toc242215142 \h </w:instrText>
         </w:r>
         <w:r>
           <w:rPr>
@@ -2382,7 +2382,7 @@
           <w14:ligatures w14:val="standardContextual"/>
         </w:rPr>
       </w:pPr>
-      <w:hyperlink w:anchor="_Toc242213002" w:history="1">
+      <w:hyperlink w:anchor="_Toc242215143" w:history="1">
         <w:r>
           <w:rPr>
             <w:rStyle w:val="Hyperlink"/>
@@ -2409,7 +2409,7 @@
             <w:noProof/>
             <w:webHidden/>
           </w:rPr>
-          <w:instrText xml:space="preserve"> PAGEREF _Toc242213002 \h </w:instrText>
+          <w:instrText xml:space="preserve"> PAGEREF _Toc242215143 \h </w:instrText>
         </w:r>
         <w:r>
           <w:rPr>
@@ -2456,7 +2456,7 @@
           <w14:ligatures w14:val="standardContextual"/>
         </w:rPr>
       </w:pPr>
-      <w:hyperlink w:anchor="_Toc242213003" w:history="1">
+      <w:hyperlink w:anchor="_Toc242215144" w:history="1">
         <w:r>
           <w:rPr>
             <w:rStyle w:val="Hyperlink"/>
@@ -2483,7 +2483,7 @@
             <w:noProof/>
             <w:webHidden/>
           </w:rPr>
-          <w:instrText xml:space="preserve"> PAGEREF _Toc242213003 \h </w:instrText>
+          <w:instrText xml:space="preserve"> PAGEREF _Toc242215144 \h </w:instrText>
         </w:r>
         <w:r>
           <w:rPr>
@@ -2530,7 +2530,7 @@
           <w14:ligatures w14:val="standardContextual"/>
         </w:rPr>
       </w:pPr>
-      <w:hyperlink w:anchor="_Toc242213004" w:history="1">
+      <w:hyperlink w:anchor="_Toc242215145" w:history="1">
         <w:r>
           <w:rPr>
             <w:rStyle w:val="Hyperlink"/>
@@ -2557,7 +2557,7 @@
             <w:noProof/>
             <w:webHidden/>
           </w:rPr>
-          <w:instrText xml:space="preserve"> PAGEREF _Toc242213004 \h </w:instrText>
+          <w:instrText xml:space="preserve"> PAGEREF _Toc242215145 \h </w:instrText>
         </w:r>
         <w:r>
           <w:rPr>
@@ -2604,7 +2604,7 @@
           <w14:ligatures w14:val="standardContextual"/>
         </w:rPr>
       </w:pPr>
-      <w:hyperlink w:anchor="_Toc242213005" w:history="1">
+      <w:hyperlink w:anchor="_Toc242215146" w:history="1">
         <w:r>
           <w:rPr>
             <w:rStyle w:val="Hyperlink"/>
@@ -2631,7 +2631,7 @@
             <w:noProof/>
             <w:webHidden/>
           </w:rPr>
-          <w:instrText xml:space="preserve"> PAGEREF _Toc242213005 \h </w:instrText>
+          <w:instrText xml:space="preserve"> PAGEREF _Toc242215146 \h </w:instrText>
         </w:r>
         <w:r>
           <w:rPr>
@@ -2678,7 +2678,7 @@
           <w14:ligatures w14:val="standardContextual"/>
         </w:rPr>
       </w:pPr>
-      <w:hyperlink w:anchor="_Toc242213006" w:history="1">
+      <w:hyperlink w:anchor="_Toc242215147" w:history="1">
         <w:r>
           <w:rPr>
             <w:rStyle w:val="Hyperlink"/>
@@ -2705,7 +2705,7 @@
             <w:noProof/>
             <w:webHidden/>
           </w:rPr>
-          <w:instrText xml:space="preserve"> PAGEREF _Toc242213006 \h </w:instrText>
+          <w:instrText xml:space="preserve"> PAGEREF _Toc242215147 \h </w:instrText>
         </w:r>
         <w:r>
           <w:rPr>
@@ -2752,7 +2752,7 @@
           <w14:ligatures w14:val="standardContextual"/>
         </w:rPr>
       </w:pPr>
-      <w:hyperlink w:anchor="_Toc242213007" w:history="1">
+      <w:hyperlink w:anchor="_Toc242215148" w:history="1">
         <w:r>
           <w:rPr>
             <w:rStyle w:val="Hyperlink"/>
@@ -2779,7 +2779,7 @@
             <w:noProof/>
             <w:webHidden/>
           </w:rPr>
-          <w:instrText xml:space="preserve"> PAGEREF _Toc242213007 \h </w:instrText>
+          <w:instrText xml:space="preserve"> PAGEREF _Toc242215148 \h </w:instrText>
         </w:r>
         <w:r>
           <w:rPr>
@@ -2826,7 +2826,7 @@
           <w14:ligatures w14:val="standardContextual"/>
         </w:rPr>
       </w:pPr>
-      <w:hyperlink w:anchor="_Toc242213008" w:history="1">
+      <w:hyperlink w:anchor="_Toc242215149" w:history="1">
         <w:r>
           <w:rPr>
             <w:rStyle w:val="Hyperlink"/>
@@ -2853,7 +2853,7 @@
             <w:noProof/>
             <w:webHidden/>
           </w:rPr>
-          <w:instrText xml:space="preserve"> PAGEREF _Toc242213008 \h </w:instrText>
+          <w:instrText xml:space="preserve"> PAGEREF _Toc242215149 \h </w:instrText>
         </w:r>
         <w:r>
           <w:rPr>
@@ -2900,7 +2900,7 @@
           <w14:ligatures w14:val="standardContextual"/>
         </w:rPr>
       </w:pPr>
-      <w:hyperlink w:anchor="_Toc242213009" w:history="1">
+      <w:hyperlink w:anchor="_Toc242215150" w:history="1">
         <w:r>
           <w:rPr>
             <w:rStyle w:val="Hyperlink"/>
@@ -2927,7 +2927,7 @@
             <w:noProof/>
             <w:webHidden/>
           </w:rPr>
-          <w:instrText xml:space="preserve"> PAGEREF _Toc242213009 \h </w:instrText>
+          <w:instrText xml:space="preserve"> PAGEREF _Toc242215150 \h </w:instrText>
         </w:r>
         <w:r>
           <w:rPr>
@@ -2974,7 +2974,7 @@
           <w14:ligatures w14:val="standardContextual"/>
         </w:rPr>
       </w:pPr>
-      <w:hyperlink w:anchor="_Toc242213010" w:history="1">
+      <w:hyperlink w:anchor="_Toc242215151" w:history="1">
         <w:r>
           <w:rPr>
             <w:rStyle w:val="Hyperlink"/>
@@ -3001,7 +3001,7 @@
             <w:noProof/>
             <w:webHidden/>
           </w:rPr>
-          <w:instrText xml:space="preserve"> PAGEREF _Toc242213010 \h </w:instrText>
+          <w:instrText xml:space="preserve"> PAGEREF _Toc242215151 \h </w:instrText>
         </w:r>
         <w:r>
           <w:rPr>
@@ -3048,7 +3048,7 @@
           <w14:ligatures w14:val="standardContextual"/>
         </w:rPr>
       </w:pPr>
-      <w:hyperlink w:anchor="_Toc242213011" w:history="1">
+      <w:hyperlink w:anchor="_Toc242215152" w:history="1">
         <w:r>
           <w:rPr>
             <w:rStyle w:val="Hyperlink"/>
@@ -3075,7 +3075,7 @@
             <w:noProof/>
             <w:webHidden/>
           </w:rPr>
-          <w:instrText xml:space="preserve"> PAGEREF _Toc242213011 \h </w:instrText>
+          <w:instrText xml:space="preserve"> PAGEREF _Toc242215152 \h </w:instrText>
         </w:r>
         <w:r>
           <w:rPr>
@@ -3122,7 +3122,7 @@
           <w14:ligatures w14:val="standardContextual"/>
         </w:rPr>
       </w:pPr>
-      <w:hyperlink w:anchor="_Toc242213012" w:history="1">
+      <w:hyperlink w:anchor="_Toc242215153" w:history="1">
         <w:r>
           <w:rPr>
             <w:rStyle w:val="Hyperlink"/>
@@ -3149,7 +3149,7 @@
             <w:noProof/>
             <w:webHidden/>
           </w:rPr>
-          <w:instrText xml:space="preserve"> PAGEREF _Toc242213012 \h </w:instrText>
+          <w:instrText xml:space="preserve"> PAGEREF _Toc242215153 \h </w:instrText>
         </w:r>
         <w:r>
           <w:rPr>
@@ -3196,7 +3196,7 @@
           <w14:ligatures w14:val="standardContextual"/>
         </w:rPr>
       </w:pPr>
-      <w:hyperlink w:anchor="_Toc242213013" w:history="1">
+      <w:hyperlink w:anchor="_Toc242215154" w:history="1">
         <w:r>
           <w:rPr>
             <w:rStyle w:val="Hyperlink"/>
@@ -3223,7 +3223,7 @@
             <w:noProof/>
             <w:webHidden/>
           </w:rPr>
-          <w:instrText xml:space="preserve"> PAGEREF _Toc242213013 \h </w:instrText>
+          <w:instrText xml:space="preserve"> PAGEREF _Toc242215154 \h </w:instrText>
         </w:r>
         <w:r>
           <w:rPr>
@@ -3270,7 +3270,7 @@
           <w14:ligatures w14:val="standardContextual"/>
         </w:rPr>
       </w:pPr>
-      <w:hyperlink w:anchor="_Toc242213014" w:history="1">
+      <w:hyperlink w:anchor="_Toc242215155" w:history="1">
         <w:r>
           <w:rPr>
             <w:rStyle w:val="Hyperlink"/>
@@ -3297,7 +3297,7 @@
             <w:noProof/>
             <w:webHidden/>
           </w:rPr>
-          <w:instrText xml:space="preserve"> PAGEREF _Toc242213014 \h </w:instrText>
+          <w:instrText xml:space="preserve"> PAGEREF _Toc242215155 \h </w:instrText>
         </w:r>
         <w:r>
           <w:rPr>
@@ -3344,7 +3344,7 @@
           <w14:ligatures w14:val="standardContextual"/>
         </w:rPr>
       </w:pPr>
-      <w:hyperlink w:anchor="_Toc242213015" w:history="1">
+      <w:hyperlink w:anchor="_Toc242215156" w:history="1">
         <w:r>
           <w:rPr>
             <w:rStyle w:val="Hyperlink"/>
@@ -3371,7 +3371,7 @@
             <w:noProof/>
             <w:webHidden/>
           </w:rPr>
-          <w:instrText xml:space="preserve"> PAGEREF _Toc242213015 \h </w:instrText>
+          <w:instrText xml:space="preserve"> PAGEREF _Toc242215156 \h </w:instrText>
         </w:r>
         <w:r>
           <w:rPr>
@@ -3418,7 +3418,7 @@
           <w14:ligatures w14:val="standardContextual"/>
         </w:rPr>
       </w:pPr>
-      <w:hyperlink w:anchor="_Toc242213016" w:history="1">
+      <w:hyperlink w:anchor="_Toc242215157" w:history="1">
         <w:r>
           <w:rPr>
             <w:rStyle w:val="Hyperlink"/>
@@ -3445,7 +3445,7 @@
             <w:noProof/>
             <w:webHidden/>
           </w:rPr>
-          <w:instrText xml:space="preserve"> PAGEREF _Toc242213016 \h </w:instrText>
+          <w:instrText xml:space="preserve"> PAGEREF _Toc242215157 \h </w:instrText>
         </w:r>
         <w:r>
           <w:rPr>
@@ -3492,7 +3492,7 @@
           <w14:ligatures w14:val="standardContextual"/>
         </w:rPr>
       </w:pPr>
-      <w:hyperlink w:anchor="_Toc242213017" w:history="1">
+      <w:hyperlink w:anchor="_Toc242215158" w:history="1">
         <w:r>
           <w:rPr>
             <w:rStyle w:val="Hyperlink"/>
@@ -3519,7 +3519,7 @@
             <w:noProof/>
             <w:webHidden/>
           </w:rPr>
-          <w:instrText xml:space="preserve"> PAGEREF _Toc242213017 \h </w:instrText>
+          <w:instrText xml:space="preserve"> PAGEREF _Toc242215158 \h </w:instrText>
         </w:r>
         <w:r>
           <w:rPr>
@@ -3566,7 +3566,7 @@
           <w14:ligatures w14:val="standardContextual"/>
         </w:rPr>
       </w:pPr>
-      <w:hyperlink w:anchor="_Toc242213018" w:history="1">
+      <w:hyperlink w:anchor="_Toc242215159" w:history="1">
         <w:r>
           <w:rPr>
             <w:rStyle w:val="Hyperlink"/>
@@ -3593,7 +3593,7 @@
             <w:noProof/>
             <w:webHidden/>
           </w:rPr>
-          <w:instrText xml:space="preserve"> PAGEREF _Toc242213018 \h </w:instrText>
+          <w:instrText xml:space="preserve"> PAGEREF _Toc242215159 \h </w:instrText>
         </w:r>
         <w:r>
           <w:rPr>
@@ -3640,7 +3640,7 @@
           <w14:ligatures w14:val="standardContextual"/>
         </w:rPr>
       </w:pPr>
-      <w:hyperlink w:anchor="_Toc242213019" w:history="1">
+      <w:hyperlink w:anchor="_Toc242215160" w:history="1">
         <w:r>
           <w:rPr>
             <w:rStyle w:val="Hyperlink"/>
@@ -3667,7 +3667,7 @@
             <w:noProof/>
             <w:webHidden/>
           </w:rPr>
-          <w:instrText xml:space="preserve"> PAGEREF _Toc242213019 \h </w:instrText>
+          <w:instrText xml:space="preserve"> PAGEREF _Toc242215160 \h </w:instrText>
         </w:r>
         <w:r>
           <w:rPr>
@@ -3714,7 +3714,7 @@
           <w14:ligatures w14:val="standardContextual"/>
         </w:rPr>
       </w:pPr>
-      <w:hyperlink w:anchor="_Toc242213020" w:history="1">
+      <w:hyperlink w:anchor="_Toc242215161" w:history="1">
         <w:r>
           <w:rPr>
             <w:rStyle w:val="Hyperlink"/>
@@ -3741,7 +3741,7 @@
             <w:noProof/>
             <w:webHidden/>
           </w:rPr>
-          <w:instrText xml:space="preserve"> PAGEREF _Toc242213020 \h </w:instrText>
+          <w:instrText xml:space="preserve"> PAGEREF _Toc242215161 \h </w:instrText>
         </w:r>
         <w:r>
           <w:rPr>
@@ -3788,7 +3788,7 @@
           <w14:ligatures w14:val="standardContextual"/>
         </w:rPr>
       </w:pPr>
-      <w:hyperlink w:anchor="_Toc242213021" w:history="1">
+      <w:hyperlink w:anchor="_Toc242215162" w:history="1">
         <w:r>
           <w:rPr>
             <w:rStyle w:val="Hyperlink"/>
@@ -3815,7 +3815,7 @@
             <w:noProof/>
             <w:webHidden/>
           </w:rPr>
-          <w:instrText xml:space="preserve"> PAGEREF _Toc242213021 \h </w:instrText>
+          <w:instrText xml:space="preserve"> PAGEREF _Toc242215162 \h </w:instrText>
         </w:r>
         <w:r>
           <w:rPr>
@@ -3862,7 +3862,7 @@
           <w14:ligatures w14:val="standardContextual"/>
         </w:rPr>
       </w:pPr>
-      <w:hyperlink w:anchor="_Toc242213022" w:history="1">
+      <w:hyperlink w:anchor="_Toc242215163" w:history="1">
         <w:r>
           <w:rPr>
             <w:rStyle w:val="Hyperlink"/>
@@ -3889,7 +3889,7 @@
             <w:noProof/>
             <w:webHidden/>
           </w:rPr>
-          <w:instrText xml:space="preserve"> PAGEREF _Toc242213022 \h </w:instrText>
+          <w:instrText xml:space="preserve"> PAGEREF _Toc242215163 \h </w:instrText>
         </w:r>
         <w:r>
           <w:rPr>
@@ -3985,7 +3985,7 @@
         </w:rPr>
         <w:lastRenderedPageBreak/>
         <w:drawing>
-          <wp:anchor distT="0" distB="0" distL="0" distR="0" simplePos="0" relativeHeight="251659264" behindDoc="1" locked="1" layoutInCell="1" allowOverlap="1" wp14:anchorId="7977E27D" wp14:editId="0738C296">
+          <wp:anchor distT="0" distB="0" distL="0" distR="0" simplePos="0" relativeHeight="251659264" behindDoc="1" locked="1" layoutInCell="1" allowOverlap="1" wp14:anchorId="414C7A15" wp14:editId="2DF44CE6">
             <wp:simplePos x="0" y="0"/>
             <wp:positionH relativeFrom="page">
               <wp:posOffset>4788000</wp:posOffset>
@@ -4032,7 +4032,7 @@
         <w:pStyle w:val="Heading1"/>
       </w:pPr>
       <w:bookmarkStart w:id="0" w:name="vg_videos"/>
-      <w:bookmarkStart w:id="1" w:name="_Toc242212971"/>
+      <w:bookmarkStart w:id="1" w:name="_Toc242215112"/>
       <w:r>
         <w:rPr>
           <w:color w:val="2E8B57"/>
@@ -4154,7 +4154,7 @@
         <w:pStyle w:val="Heading2"/>
       </w:pPr>
       <w:bookmarkStart w:id="2" w:name="vg_set"/>
-      <w:bookmarkStart w:id="3" w:name="_Toc242212972"/>
+      <w:bookmarkStart w:id="3" w:name="_Toc242215113"/>
       <w:r>
         <w:rPr>
           <w:color w:val="2E8B57"/>
@@ -4874,7 +4874,7 @@
         <w:pStyle w:val="Heading2"/>
       </w:pPr>
       <w:bookmarkStart w:id="4" w:name="vg_lengths"/>
-      <w:bookmarkStart w:id="5" w:name="_Toc242212973"/>
+      <w:bookmarkStart w:id="5" w:name="_Toc242215114"/>
       <w:r>
         <w:rPr>
           <w:color w:val="2E8B57"/>
@@ -4984,7 +4984,7 @@
         </w:rPr>
         <w:lastRenderedPageBreak/>
         <w:drawing>
-          <wp:anchor distT="0" distB="0" distL="0" distR="0" simplePos="0" relativeHeight="251660288" behindDoc="1" locked="1" layoutInCell="1" allowOverlap="1" wp14:anchorId="278D9AA2" wp14:editId="7E71FDC8">
+          <wp:anchor distT="0" distB="0" distL="0" distR="0" simplePos="0" relativeHeight="251660288" behindDoc="1" locked="1" layoutInCell="1" allowOverlap="1" wp14:anchorId="1036E228" wp14:editId="248EE0C4">
             <wp:simplePos x="0" y="0"/>
             <wp:positionH relativeFrom="page">
               <wp:posOffset>4788000</wp:posOffset>
@@ -5031,7 +5031,7 @@
         <w:pStyle w:val="Heading1"/>
       </w:pPr>
       <w:bookmarkStart w:id="6" w:name="vg_setup"/>
-      <w:bookmarkStart w:id="7" w:name="_Toc242212974"/>
+      <w:bookmarkStart w:id="7" w:name="_Toc242215115"/>
       <w:r>
         <w:rPr>
           <w:color w:val="2E8B57"/>
@@ -5262,7 +5262,7 @@
         <w:pStyle w:val="Heading2"/>
       </w:pPr>
       <w:bookmarkStart w:id="8" w:name="vg_machine"/>
-      <w:bookmarkStart w:id="9" w:name="_Toc242212975"/>
+      <w:bookmarkStart w:id="9" w:name="_Toc242215116"/>
       <w:r>
         <w:rPr>
           <w:color w:val="2E8B57"/>
@@ -5682,7 +5682,7 @@
         <w:pStyle w:val="Heading2"/>
       </w:pPr>
       <w:bookmarkStart w:id="10" w:name="vg_software"/>
-      <w:bookmarkStart w:id="11" w:name="_Toc242212976"/>
+      <w:bookmarkStart w:id="11" w:name="_Toc242215117"/>
       <w:r>
         <w:rPr>
           <w:color w:val="2E8B57"/>
@@ -6060,7 +6060,7 @@
         <w:pStyle w:val="Heading2"/>
       </w:pPr>
       <w:bookmarkStart w:id="12" w:name="vg_resolution"/>
-      <w:bookmarkStart w:id="13" w:name="_Toc242212977"/>
+      <w:bookmarkStart w:id="13" w:name="_Toc242215118"/>
       <w:r>
         <w:rPr>
           <w:color w:val="2E8B57"/>
@@ -6520,7 +6520,7 @@
         <w:pStyle w:val="Heading2"/>
       </w:pPr>
       <w:bookmarkStart w:id="14" w:name="vg_obs"/>
-      <w:bookmarkStart w:id="15" w:name="_Toc242212978"/>
+      <w:bookmarkStart w:id="15" w:name="_Toc242215119"/>
       <w:r>
         <w:rPr>
           <w:color w:val="2E8B57"/>
@@ -7859,7 +7859,7 @@
         <w:pStyle w:val="Heading2"/>
       </w:pPr>
       <w:bookmarkStart w:id="16" w:name="vg_mic"/>
-      <w:bookmarkStart w:id="17" w:name="_Toc242212979"/>
+      <w:bookmarkStart w:id="17" w:name="_Toc242215120"/>
       <w:r>
         <w:rPr>
           <w:color w:val="2E8B57"/>
@@ -8425,7 +8425,7 @@
         <w:pStyle w:val="Heading2"/>
       </w:pPr>
       <w:bookmarkStart w:id="18" w:name="vg_windows"/>
-      <w:bookmarkStart w:id="19" w:name="_Toc242212980"/>
+      <w:bookmarkStart w:id="19" w:name="_Toc242215121"/>
       <w:r>
         <w:rPr>
           <w:color w:val="2E8B57"/>
@@ -8718,7 +8718,7 @@
         <w:pStyle w:val="Heading2"/>
       </w:pPr>
       <w:bookmarkStart w:id="20" w:name="vg_unreal"/>
-      <w:bookmarkStart w:id="21" w:name="_Toc242212981"/>
+      <w:bookmarkStart w:id="21" w:name="_Toc242215122"/>
       <w:r>
         <w:rPr>
           <w:color w:val="2E8B57"/>
@@ -9279,7 +9279,7 @@
         <w:pStyle w:val="Heading2"/>
       </w:pPr>
       <w:bookmarkStart w:id="22" w:name="vg_checklist"/>
-      <w:bookmarkStart w:id="23" w:name="_Toc242212982"/>
+      <w:bookmarkStart w:id="23" w:name="_Toc242215123"/>
       <w:r>
         <w:rPr>
           <w:color w:val="2E8B57"/>
@@ -9520,7 +9520,7 @@
         </w:rPr>
         <w:lastRenderedPageBreak/>
         <w:drawing>
-          <wp:anchor distT="0" distB="0" distL="0" distR="0" simplePos="0" relativeHeight="251661312" behindDoc="1" locked="1" layoutInCell="1" allowOverlap="1" wp14:anchorId="7621E60D" wp14:editId="0D837F6E">
+          <wp:anchor distT="0" distB="0" distL="0" distR="0" simplePos="0" relativeHeight="251661312" behindDoc="1" locked="1" layoutInCell="1" allowOverlap="1" wp14:anchorId="18517694" wp14:editId="083EC829">
             <wp:simplePos x="0" y="0"/>
             <wp:positionH relativeFrom="page">
               <wp:posOffset>4788000</wp:posOffset>
@@ -9567,7 +9567,7 @@
         <w:pStyle w:val="Heading1"/>
       </w:pPr>
       <w:bookmarkStart w:id="24" w:name="vg_style"/>
-      <w:bookmarkStart w:id="25" w:name="_Toc242212983"/>
+      <w:bookmarkStart w:id="25" w:name="_Toc242215124"/>
       <w:r>
         <w:rPr>
           <w:color w:val="2E8B57"/>
@@ -9703,7 +9703,7 @@
         <w:pStyle w:val="Heading2"/>
       </w:pPr>
       <w:bookmarkStart w:id="26" w:name="vg_voice"/>
-      <w:bookmarkStart w:id="27" w:name="_Toc242212984"/>
+      <w:bookmarkStart w:id="27" w:name="_Toc242215125"/>
       <w:r>
         <w:rPr>
           <w:color w:val="2E8B57"/>
@@ -9852,7 +9852,7 @@
         <w:pStyle w:val="Heading2"/>
       </w:pPr>
       <w:bookmarkStart w:id="28" w:name="vg_pointer"/>
-      <w:bookmarkStart w:id="29" w:name="_Toc242212985"/>
+      <w:bookmarkStart w:id="29" w:name="_Toc242215126"/>
       <w:r>
         <w:rPr>
           <w:color w:val="2E8B57"/>
@@ -9906,7 +9906,7 @@
         <w:pStyle w:val="Heading2"/>
       </w:pPr>
       <w:bookmarkStart w:id="30" w:name="vg_takes"/>
-      <w:bookmarkStart w:id="31" w:name="_Toc242212986"/>
+      <w:bookmarkStart w:id="31" w:name="_Toc242215127"/>
       <w:r>
         <w:rPr>
           <w:color w:val="2E8B57"/>
@@ -9967,7 +9967,7 @@
         </w:rPr>
         <w:lastRenderedPageBreak/>
         <w:drawing>
-          <wp:anchor distT="0" distB="0" distL="0" distR="0" simplePos="0" relativeHeight="251662336" behindDoc="1" locked="1" layoutInCell="1" allowOverlap="1" wp14:anchorId="08BC586F" wp14:editId="3C995A04">
+          <wp:anchor distT="0" distB="0" distL="0" distR="0" simplePos="0" relativeHeight="251662336" behindDoc="1" locked="1" layoutInCell="1" allowOverlap="1" wp14:anchorId="6B918FCE" wp14:editId="4A46B38B">
             <wp:simplePos x="0" y="0"/>
             <wp:positionH relativeFrom="page">
               <wp:posOffset>4788000</wp:posOffset>
@@ -10014,7 +10014,7 @@
         <w:pStyle w:val="Heading1"/>
       </w:pPr>
       <w:bookmarkStart w:id="32" w:name="vg_v1"/>
-      <w:bookmarkStart w:id="33" w:name="_Toc242212987"/>
+      <w:bookmarkStart w:id="33" w:name="_Toc242215128"/>
       <w:r>
         <w:rPr>
           <w:color w:val="2E8B57"/>
@@ -10131,7 +10131,7 @@
         <w:pStyle w:val="Heading2"/>
       </w:pPr>
       <w:bookmarkStart w:id="34" w:name="vg_v1_setup"/>
-      <w:bookmarkStart w:id="35" w:name="_Toc242212988"/>
+      <w:bookmarkStart w:id="35" w:name="_Toc242215129"/>
       <w:r>
         <w:rPr>
           <w:color w:val="2E8B57"/>
@@ -10512,7 +10512,7 @@
         <w:pStyle w:val="Heading2"/>
       </w:pPr>
       <w:bookmarkStart w:id="36" w:name="vg_v1_script"/>
-      <w:bookmarkStart w:id="37" w:name="_Toc242212989"/>
+      <w:bookmarkStart w:id="37" w:name="_Toc242215130"/>
       <w:r>
         <w:rPr>
           <w:color w:val="2E8B57"/>
@@ -13096,7 +13096,7 @@
         </w:rPr>
         <w:lastRenderedPageBreak/>
         <w:drawing>
-          <wp:anchor distT="0" distB="0" distL="0" distR="0" simplePos="0" relativeHeight="251663360" behindDoc="1" locked="1" layoutInCell="1" allowOverlap="1" wp14:anchorId="621F0E10" wp14:editId="5C6B6802">
+          <wp:anchor distT="0" distB="0" distL="0" distR="0" simplePos="0" relativeHeight="251663360" behindDoc="1" locked="1" layoutInCell="1" allowOverlap="1" wp14:anchorId="1562AFF1" wp14:editId="06047F3B">
             <wp:simplePos x="0" y="0"/>
             <wp:positionH relativeFrom="page">
               <wp:posOffset>4788000</wp:posOffset>
@@ -13143,7 +13143,7 @@
         <w:pStyle w:val="Heading1"/>
       </w:pPr>
       <w:bookmarkStart w:id="38" w:name="vg_v2"/>
-      <w:bookmarkStart w:id="39" w:name="_Toc242212990"/>
+      <w:bookmarkStart w:id="39" w:name="_Toc242215131"/>
       <w:r>
         <w:rPr>
           <w:color w:val="2E8B57"/>
@@ -13260,7 +13260,7 @@
         <w:pStyle w:val="Heading2"/>
       </w:pPr>
       <w:bookmarkStart w:id="40" w:name="vg_v2_setup"/>
-      <w:bookmarkStart w:id="41" w:name="_Toc242212991"/>
+      <w:bookmarkStart w:id="41" w:name="_Toc242215132"/>
       <w:r>
         <w:rPr>
           <w:color w:val="2E8B57"/>
@@ -13557,7 +13557,7 @@
         <w:pStyle w:val="Heading2"/>
       </w:pPr>
       <w:bookmarkStart w:id="42" w:name="vg_v2_script"/>
-      <w:bookmarkStart w:id="43" w:name="_Toc242212992"/>
+      <w:bookmarkStart w:id="43" w:name="_Toc242215133"/>
       <w:r>
         <w:rPr>
           <w:color w:val="2E8B57"/>
@@ -15878,7 +15878,7 @@
         </w:rPr>
         <w:lastRenderedPageBreak/>
         <w:drawing>
-          <wp:anchor distT="0" distB="0" distL="0" distR="0" simplePos="0" relativeHeight="251664384" behindDoc="1" locked="1" layoutInCell="1" allowOverlap="1" wp14:anchorId="1F81F9A8" wp14:editId="58536F35">
+          <wp:anchor distT="0" distB="0" distL="0" distR="0" simplePos="0" relativeHeight="251664384" behindDoc="1" locked="1" layoutInCell="1" allowOverlap="1" wp14:anchorId="7591A344" wp14:editId="6F3167AE">
             <wp:simplePos x="0" y="0"/>
             <wp:positionH relativeFrom="page">
               <wp:posOffset>4788000</wp:posOffset>
@@ -15925,7 +15925,7 @@
         <w:pStyle w:val="Heading1"/>
       </w:pPr>
       <w:bookmarkStart w:id="44" w:name="vg_v3"/>
-      <w:bookmarkStart w:id="45" w:name="_Toc242212993"/>
+      <w:bookmarkStart w:id="45" w:name="_Toc242215134"/>
       <w:r>
         <w:rPr>
           <w:color w:val="2E8B57"/>
@@ -16042,7 +16042,7 @@
         <w:pStyle w:val="Heading2"/>
       </w:pPr>
       <w:bookmarkStart w:id="46" w:name="vg_v3_setup"/>
-      <w:bookmarkStart w:id="47" w:name="_Toc242212994"/>
+      <w:bookmarkStart w:id="47" w:name="_Toc242215135"/>
       <w:r>
         <w:rPr>
           <w:color w:val="2E8B57"/>
@@ -16409,7 +16409,7 @@
         <w:pStyle w:val="Heading2"/>
       </w:pPr>
       <w:bookmarkStart w:id="48" w:name="vg_v3_script"/>
-      <w:bookmarkStart w:id="49" w:name="_Toc242212995"/>
+      <w:bookmarkStart w:id="49" w:name="_Toc242215136"/>
       <w:r>
         <w:rPr>
           <w:color w:val="2E8B57"/>
@@ -18651,7 +18651,7 @@
         </w:rPr>
         <w:lastRenderedPageBreak/>
         <w:drawing>
-          <wp:anchor distT="0" distB="0" distL="0" distR="0" simplePos="0" relativeHeight="251665408" behindDoc="1" locked="1" layoutInCell="1" allowOverlap="1" wp14:anchorId="13DE218B" wp14:editId="4BB98A71">
+          <wp:anchor distT="0" distB="0" distL="0" distR="0" simplePos="0" relativeHeight="251665408" behindDoc="1" locked="1" layoutInCell="1" allowOverlap="1" wp14:anchorId="55636157" wp14:editId="609A2C6E">
             <wp:simplePos x="0" y="0"/>
             <wp:positionH relativeFrom="page">
               <wp:posOffset>4788000</wp:posOffset>
@@ -18698,7 +18698,7 @@
         <w:pStyle w:val="Heading1"/>
       </w:pPr>
       <w:bookmarkStart w:id="50" w:name="vg_v4"/>
-      <w:bookmarkStart w:id="51" w:name="_Toc242212996"/>
+      <w:bookmarkStart w:id="51" w:name="_Toc242215137"/>
       <w:r>
         <w:rPr>
           <w:color w:val="2E8B57"/>
@@ -18815,7 +18815,7 @@
         <w:pStyle w:val="Heading2"/>
       </w:pPr>
       <w:bookmarkStart w:id="52" w:name="vg_v4_setup"/>
-      <w:bookmarkStart w:id="53" w:name="_Toc242212997"/>
+      <w:bookmarkStart w:id="53" w:name="_Toc242215138"/>
       <w:r>
         <w:rPr>
           <w:color w:val="2E8B57"/>
@@ -19129,7 +19129,7 @@
         <w:pStyle w:val="Heading2"/>
       </w:pPr>
       <w:bookmarkStart w:id="54" w:name="vg_v4_script"/>
-      <w:bookmarkStart w:id="55" w:name="_Toc242212998"/>
+      <w:bookmarkStart w:id="55" w:name="_Toc242215139"/>
       <w:r>
         <w:rPr>
           <w:color w:val="2E8B57"/>
@@ -21021,7 +21021,7 @@
         </w:rPr>
         <w:lastRenderedPageBreak/>
         <w:drawing>
-          <wp:anchor distT="0" distB="0" distL="0" distR="0" simplePos="0" relativeHeight="251666432" behindDoc="1" locked="1" layoutInCell="1" allowOverlap="1" wp14:anchorId="2800ECB1" wp14:editId="4684FB65">
+          <wp:anchor distT="0" distB="0" distL="0" distR="0" simplePos="0" relativeHeight="251666432" behindDoc="1" locked="1" layoutInCell="1" allowOverlap="1" wp14:anchorId="15A77266" wp14:editId="53DC5EE3">
             <wp:simplePos x="0" y="0"/>
             <wp:positionH relativeFrom="page">
               <wp:posOffset>4788000</wp:posOffset>
@@ -21068,7 +21068,7 @@
         <w:pStyle w:val="Heading1"/>
       </w:pPr>
       <w:bookmarkStart w:id="56" w:name="vg_listing"/>
-      <w:bookmarkStart w:id="57" w:name="_Toc242212999"/>
+      <w:bookmarkStart w:id="57" w:name="_Toc242215140"/>
       <w:r>
         <w:rPr>
           <w:color w:val="2E8B57"/>
@@ -21203,7 +21203,7 @@
         <w:pStyle w:val="Heading2"/>
       </w:pPr>
       <w:bookmarkStart w:id="58" w:name="vg_t1"/>
-      <w:bookmarkStart w:id="59" w:name="_Toc242213000"/>
+      <w:bookmarkStart w:id="59" w:name="_Toc242215141"/>
       <w:r>
         <w:rPr>
           <w:color w:val="2E8B57"/>
@@ -22604,7 +22604,7 @@
         <w:pStyle w:val="Heading2"/>
       </w:pPr>
       <w:bookmarkStart w:id="60" w:name="vg_t2"/>
-      <w:bookmarkStart w:id="61" w:name="_Toc242213001"/>
+      <w:bookmarkStart w:id="61" w:name="_Toc242215142"/>
       <w:r>
         <w:rPr>
           <w:color w:val="2E8B57"/>
@@ -23540,7 +23540,7 @@
         </w:rPr>
         <w:lastRenderedPageBreak/>
         <w:drawing>
-          <wp:anchor distT="0" distB="0" distL="0" distR="0" simplePos="0" relativeHeight="251667456" behindDoc="1" locked="1" layoutInCell="1" allowOverlap="1" wp14:anchorId="76AD3B43" wp14:editId="6EC776EB">
+          <wp:anchor distT="0" distB="0" distL="0" distR="0" simplePos="0" relativeHeight="251667456" behindDoc="1" locked="1" layoutInCell="1" allowOverlap="1" wp14:anchorId="48310E45" wp14:editId="1CFD44CF">
             <wp:simplePos x="0" y="0"/>
             <wp:positionH relativeFrom="page">
               <wp:posOffset>4788000</wp:posOffset>
@@ -23587,7 +23587,7 @@
         <w:pStyle w:val="Heading1"/>
       </w:pPr>
       <w:bookmarkStart w:id="62" w:name="vg_editing"/>
-      <w:bookmarkStart w:id="63" w:name="_Toc242213002"/>
+      <w:bookmarkStart w:id="63" w:name="_Toc242215143"/>
       <w:r>
         <w:rPr>
           <w:color w:val="2E8B57"/>
@@ -23818,7 +23818,7 @@
         <w:pStyle w:val="Heading2"/>
       </w:pPr>
       <w:bookmarkStart w:id="64" w:name="vg_edit_project"/>
-      <w:bookmarkStart w:id="65" w:name="_Toc242213003"/>
+      <w:bookmarkStart w:id="65" w:name="_Toc242215144"/>
       <w:r>
         <w:rPr>
           <w:color w:val="2E8B57"/>
@@ -23961,7 +23961,7 @@
         <w:pStyle w:val="Heading2"/>
       </w:pPr>
       <w:bookmarkStart w:id="66" w:name="vg_timeline"/>
-      <w:bookmarkStart w:id="67" w:name="_Toc242213004"/>
+      <w:bookmarkStart w:id="67" w:name="_Toc242215145"/>
       <w:r>
         <w:rPr>
           <w:color w:val="2E8B57"/>
@@ -24309,7 +24309,7 @@
         <w:pStyle w:val="Heading2"/>
       </w:pPr>
       <w:bookmarkStart w:id="68" w:name="vg_zoom"/>
-      <w:bookmarkStart w:id="69" w:name="_Toc242213005"/>
+      <w:bookmarkStart w:id="69" w:name="_Toc242215146"/>
       <w:r>
         <w:rPr>
           <w:color w:val="2E8B57"/>
@@ -24727,7 +24727,7 @@
         <w:pStyle w:val="Heading2"/>
       </w:pPr>
       <w:bookmarkStart w:id="70" w:name="vg_callouts"/>
-      <w:bookmarkStart w:id="71" w:name="_Toc242213006"/>
+      <w:bookmarkStart w:id="71" w:name="_Toc242215147"/>
       <w:r>
         <w:rPr>
           <w:color w:val="2E8B57"/>
@@ -25054,7 +25054,7 @@
         <w:pStyle w:val="Heading2"/>
       </w:pPr>
       <w:bookmarkStart w:id="72" w:name="vg_captions"/>
-      <w:bookmarkStart w:id="73" w:name="_Toc242213007"/>
+      <w:bookmarkStart w:id="73" w:name="_Toc242215148"/>
       <w:r>
         <w:rPr>
           <w:color w:val="2E8B57"/>
@@ -25152,7 +25152,7 @@
         <w:pStyle w:val="Heading2"/>
       </w:pPr>
       <w:bookmarkStart w:id="74" w:name="vg_loudness"/>
-      <w:bookmarkStart w:id="75" w:name="_Toc242213008"/>
+      <w:bookmarkStart w:id="75" w:name="_Toc242215149"/>
       <w:r>
         <w:rPr>
           <w:color w:val="2E8B57"/>
@@ -25265,7 +25265,7 @@
         <w:pStyle w:val="Heading2"/>
       </w:pPr>
       <w:bookmarkStart w:id="76" w:name="vg_music"/>
-      <w:bookmarkStart w:id="77" w:name="_Toc242213009"/>
+      <w:bookmarkStart w:id="77" w:name="_Toc242215150"/>
       <w:r>
         <w:rPr>
           <w:color w:val="2E8B57"/>
@@ -25346,7 +25346,7 @@
         <w:pStyle w:val="Heading2"/>
       </w:pPr>
       <w:bookmarkStart w:id="78" w:name="vg_comparison"/>
-      <w:bookmarkStart w:id="79" w:name="_Toc242213010"/>
+      <w:bookmarkStart w:id="79" w:name="_Toc242215151"/>
       <w:r>
         <w:rPr>
           <w:color w:val="2E8B57"/>
@@ -25480,7 +25480,7 @@
         </w:rPr>
         <w:lastRenderedPageBreak/>
         <w:drawing>
-          <wp:anchor distT="0" distB="0" distL="0" distR="0" simplePos="0" relativeHeight="251668480" behindDoc="1" locked="1" layoutInCell="1" allowOverlap="1" wp14:anchorId="7529FFB1" wp14:editId="67431FE9">
+          <wp:anchor distT="0" distB="0" distL="0" distR="0" simplePos="0" relativeHeight="251668480" behindDoc="1" locked="1" layoutInCell="1" allowOverlap="1" wp14:anchorId="3B458793" wp14:editId="756EEC17">
             <wp:simplePos x="0" y="0"/>
             <wp:positionH relativeFrom="page">
               <wp:posOffset>4788000</wp:posOffset>
@@ -25527,7 +25527,7 @@
         <w:pStyle w:val="Heading1"/>
       </w:pPr>
       <w:bookmarkStart w:id="80" w:name="vg_publishing"/>
-      <w:bookmarkStart w:id="81" w:name="_Toc242213011"/>
+      <w:bookmarkStart w:id="81" w:name="_Toc242215152"/>
       <w:r>
         <w:rPr>
           <w:color w:val="2E8B57"/>
@@ -25663,7 +25663,7 @@
         <w:pStyle w:val="Heading2"/>
       </w:pPr>
       <w:bookmarkStart w:id="82" w:name="vg_export"/>
-      <w:bookmarkStart w:id="83" w:name="_Toc242213012"/>
+      <w:bookmarkStart w:id="83" w:name="_Toc242215153"/>
       <w:r>
         <w:rPr>
           <w:color w:val="2E8B57"/>
@@ -26152,7 +26152,7 @@
         <w:pStyle w:val="Heading2"/>
       </w:pPr>
       <w:bookmarkStart w:id="84" w:name="vg_youtube"/>
-      <w:bookmarkStart w:id="85" w:name="_Toc242213013"/>
+      <w:bookmarkStart w:id="85" w:name="_Toc242215154"/>
       <w:r>
         <w:rPr>
           <w:color w:val="2E8B57"/>
@@ -26392,7 +26392,7 @@
         <w:pStyle w:val="Heading2"/>
       </w:pPr>
       <w:bookmarkStart w:id="86" w:name="vg_links"/>
-      <w:bookmarkStart w:id="87" w:name="_Toc242213014"/>
+      <w:bookmarkStart w:id="87" w:name="_Toc242215155"/>
       <w:r>
         <w:rPr>
           <w:color w:val="2E8B57"/>
@@ -26569,7 +26569,7 @@
         </w:rPr>
         <w:lastRenderedPageBreak/>
         <w:drawing>
-          <wp:anchor distT="0" distB="0" distL="0" distR="0" simplePos="0" relativeHeight="251669504" behindDoc="1" locked="1" layoutInCell="1" allowOverlap="1" wp14:anchorId="152C1C2B" wp14:editId="58414E06">
+          <wp:anchor distT="0" distB="0" distL="0" distR="0" simplePos="0" relativeHeight="251669504" behindDoc="1" locked="1" layoutInCell="1" allowOverlap="1" wp14:anchorId="3B641874" wp14:editId="0A0AFBC7">
             <wp:simplePos x="0" y="0"/>
             <wp:positionH relativeFrom="page">
               <wp:posOffset>4788000</wp:posOffset>
@@ -26616,7 +26616,7 @@
         <w:pStyle w:val="Heading1"/>
       </w:pPr>
       <w:bookmarkStart w:id="88" w:name="vg_qc"/>
-      <w:bookmarkStart w:id="89" w:name="_Toc242213015"/>
+      <w:bookmarkStart w:id="89" w:name="_Toc242215156"/>
       <w:r>
         <w:rPr>
           <w:color w:val="2E8B57"/>
@@ -26752,7 +26752,7 @@
         <w:pStyle w:val="Heading2"/>
       </w:pPr>
       <w:bookmarkStart w:id="90" w:name="vg_qc_all"/>
-      <w:bookmarkStart w:id="91" w:name="_Toc242213016"/>
+      <w:bookmarkStart w:id="91" w:name="_Toc242215157"/>
       <w:r>
         <w:rPr>
           <w:color w:val="2E8B57"/>
@@ -26925,7 +26925,7 @@
         <w:pStyle w:val="Heading2"/>
       </w:pPr>
       <w:bookmarkStart w:id="92" w:name="vg_qc_each"/>
-      <w:bookmarkStart w:id="93" w:name="_Toc242213017"/>
+      <w:bookmarkStart w:id="93" w:name="_Toc242215158"/>
       <w:r>
         <w:rPr>
           <w:color w:val="2E8B57"/>
@@ -27211,7 +27211,7 @@
         <w:pStyle w:val="Heading2"/>
       </w:pPr>
       <w:bookmarkStart w:id="94" w:name="vg_schedule"/>
-      <w:bookmarkStart w:id="95" w:name="_Toc242213018"/>
+      <w:bookmarkStart w:id="95" w:name="_Toc242215159"/>
       <w:r>
         <w:rPr>
           <w:color w:val="2E8B57"/>
@@ -28000,7 +28000,7 @@
         </w:rPr>
         <w:lastRenderedPageBreak/>
         <w:drawing>
-          <wp:anchor distT="0" distB="0" distL="0" distR="0" simplePos="0" relativeHeight="251670528" behindDoc="1" locked="1" layoutInCell="1" allowOverlap="1" wp14:anchorId="5C5B230E" wp14:editId="2F5CB8FD">
+          <wp:anchor distT="0" distB="0" distL="0" distR="0" simplePos="0" relativeHeight="251670528" behindDoc="1" locked="1" layoutInCell="1" allowOverlap="1" wp14:anchorId="6269A867" wp14:editId="0A6E7095">
             <wp:simplePos x="0" y="0"/>
             <wp:positionH relativeFrom="page">
               <wp:posOffset>4788000</wp:posOffset>
@@ -28047,7 +28047,7 @@
         <w:pStyle w:val="Heading1"/>
       </w:pPr>
       <w:bookmarkStart w:id="96" w:name="vg_automation"/>
-      <w:bookmarkStart w:id="97" w:name="_Toc242213019"/>
+      <w:bookmarkStart w:id="97" w:name="_Toc242215160"/>
       <w:r>
         <w:rPr>
           <w:color w:val="2E8B57"/>
@@ -28260,7 +28260,7 @@
         <w:pStyle w:val="Heading2"/>
       </w:pPr>
       <w:bookmarkStart w:id="98" w:name="vg_auto_frames"/>
-      <w:bookmarkStart w:id="99" w:name="_Toc242213020"/>
+      <w:bookmarkStart w:id="99" w:name="_Toc242215161"/>
       <w:r>
         <w:rPr>
           <w:color w:val="2E8B57"/>
@@ -28374,7 +28374,7 @@
         <w:pStyle w:val="Heading2"/>
       </w:pPr>
       <w:bookmarkStart w:id="100" w:name="vg_auto_takes"/>
-      <w:bookmarkStart w:id="101" w:name="_Toc242213021"/>
+      <w:bookmarkStart w:id="101" w:name="_Toc242215162"/>
       <w:r>
         <w:rPr>
           <w:color w:val="2E8B57"/>
@@ -28400,7 +28400,7 @@
         <w:pStyle w:val="Heading2"/>
       </w:pPr>
       <w:bookmarkStart w:id="102" w:name="vg_auto_split"/>
-      <w:bookmarkStart w:id="103" w:name="_Toc242213022"/>
+      <w:bookmarkStart w:id="103" w:name="_Toc242215163"/>
       <w:r>
         <w:rPr>
           <w:color w:val="2E8B57"/>
@@ -31188,52 +31188,52 @@
       </w:rPr>
     </w:lvl>
   </w:abstractNum>
-  <w:num w:numId="1" w16cid:durableId="1875271515">
+  <w:num w:numId="1" w16cid:durableId="926307764">
     <w:abstractNumId w:val="8"/>
   </w:num>
-  <w:num w:numId="2" w16cid:durableId="256597114">
+  <w:num w:numId="2" w16cid:durableId="287703383">
     <w:abstractNumId w:val="6"/>
   </w:num>
-  <w:num w:numId="3" w16cid:durableId="152839372">
+  <w:num w:numId="3" w16cid:durableId="1231303403">
     <w:abstractNumId w:val="5"/>
   </w:num>
-  <w:num w:numId="4" w16cid:durableId="1115246336">
+  <w:num w:numId="4" w16cid:durableId="1116366944">
     <w:abstractNumId w:val="4"/>
   </w:num>
-  <w:num w:numId="5" w16cid:durableId="125782500">
+  <w:num w:numId="5" w16cid:durableId="2147310274">
     <w:abstractNumId w:val="7"/>
   </w:num>
-  <w:num w:numId="6" w16cid:durableId="349986356">
+  <w:num w:numId="6" w16cid:durableId="170606605">
     <w:abstractNumId w:val="3"/>
   </w:num>
-  <w:num w:numId="7" w16cid:durableId="708843498">
+  <w:num w:numId="7" w16cid:durableId="1036079117">
     <w:abstractNumId w:val="2"/>
   </w:num>
-  <w:num w:numId="8" w16cid:durableId="1120421242">
+  <w:num w:numId="8" w16cid:durableId="1903708642">
     <w:abstractNumId w:val="1"/>
   </w:num>
-  <w:num w:numId="9" w16cid:durableId="658971512">
+  <w:num w:numId="9" w16cid:durableId="1262838465">
     <w:abstractNumId w:val="0"/>
   </w:num>
-  <w:num w:numId="10" w16cid:durableId="139688283">
+  <w:num w:numId="10" w16cid:durableId="1473331188">
     <w:abstractNumId w:val="7"/>
     <w:lvlOverride w:ilvl="0">
       <w:startOverride w:val="1"/>
     </w:lvlOverride>
   </w:num>
-  <w:num w:numId="11" w16cid:durableId="1221671671">
+  <w:num w:numId="11" w16cid:durableId="1419013955">
     <w:abstractNumId w:val="7"/>
     <w:lvlOverride w:ilvl="0">
       <w:startOverride w:val="1"/>
     </w:lvlOverride>
   </w:num>
-  <w:num w:numId="12" w16cid:durableId="1313559321">
+  <w:num w:numId="12" w16cid:durableId="1033186605">
     <w:abstractNumId w:val="7"/>
     <w:lvlOverride w:ilvl="0">
       <w:startOverride w:val="1"/>
     </w:lvlOverride>
   </w:num>
-  <w:num w:numId="13" w16cid:durableId="1907229047">
+  <w:num w:numId="13" w16cid:durableId="163782804">
     <w:abstractNumId w:val="7"/>
     <w:lvlOverride w:ilvl="0">
       <w:startOverride w:val="1"/>
@@ -42752,7 +42752,7 @@
     <w:autoRedefine/>
     <w:uiPriority w:val="39"/>
     <w:unhideWhenUsed/>
-    <w:rsid w:val="00AA2D92"/>
+    <w:rsid w:val="00797C1D"/>
     <w:pPr>
       <w:spacing w:after="100"/>
     </w:pPr>
@@ -42764,7 +42764,7 @@
     <w:autoRedefine/>
     <w:uiPriority w:val="39"/>
     <w:unhideWhenUsed/>
-    <w:rsid w:val="00AA2D92"/>
+    <w:rsid w:val="00797C1D"/>
     <w:pPr>
       <w:spacing w:after="100"/>
       <w:ind w:left="200"/>
@@ -42775,7 +42775,7 @@
     <w:basedOn w:val="DefaultParagraphFont"/>
     <w:uiPriority w:val="99"/>
     <w:unhideWhenUsed/>
-    <w:rsid w:val="00AA2D92"/>
+    <w:rsid w:val="00797C1D"/>
     <w:rPr>
       <w:color w:val="0000FF" w:themeColor="hyperlink"/>
       <w:u w:val="single"/>

</xml_diff>